<commit_message>
Laporan Termin Sertifikasi LGU rev 0.2: status per 2 Okt (uji termal, pengajuan GTS, Ex d), framing tindak lanjut
Co-Authored-By: Claude Opus 5.5 <noreply@anthropic.com>
</commit_message>
<xml_diff>
--- a/Paket LGU/02_Penagihan_Termin_1/src/Laporan_Termin_1_Sertifikasi_LGU.docx
+++ b/Paket LGU/02_Penagihan_Termin_1/src/Laporan_Termin_1_Sertifikasi_LGU.docx
@@ -175,7 +175,7 @@
                 <w:color w:val="20262B"/>
                 <w:sz w:val="18"/>
               </w:rPr>
-              <w:t>0.1</w:t>
+              <w:t>0.2</w:t>
             </w:r>
           </w:p>
         </w:tc>
@@ -232,7 +232,7 @@
                 <w:color w:val="20262B"/>
                 <w:sz w:val="18"/>
               </w:rPr>
-              <w:t>15 September 2026</w:t>
+              <w:t>2 Oktober 2026</w:t>
             </w:r>
           </w:p>
         </w:tc>
@@ -434,7 +434,7 @@
           <w:color w:val="20262B"/>
           <w:sz w:val="20"/>
         </w:rPr>
-        <w:t>Laporan ini menyajikan seluruh bukti dan kekurangan yang teridentifikasi terhadap syarat Termin 1 sertifikasi apa adanya. Penilaian pemenuhan dan keputusan kesiapan pembayaran sepenuhnya merupakan evaluasi PT Pertamina Patra Niaga.</w:t>
+        <w:t>Laporan ini menyajikan seluruh bukti pemenuhan dan pekerjaan lanjutan terhadap syarat Termin 1 sertifikasi apa adanya. Penilaian pemenuhan dan keputusan kesiapan pembayaran sepenuhnya merupakan evaluasi PT Pertamina Patra Niaga.</w:t>
       </w:r>
     </w:p>
     <w:p>
@@ -477,7 +477,7 @@
           <w:color w:val="20262B"/>
           <w:sz w:val="21"/>
         </w:rPr>
-        <w:t>Dokumen ini menyampaikan status pemenuhan syarat Termin 1 pada skema pembayaran dua termin proyek sertifikasi ATEX/IECEx Gas Leak Detector (GLD, Node Sensor) — Termin 1 sebesar 40 persen dari nilai SPK sertifikasi. Laporan menampilkan seluruh bukti yang tersedia di sisi tim pengembang serta kekurangan yang masih teridentifikasi terhadap syarat kontraktual, tanpa menyimpulkan sendiri layak atau tidaknya pengajuan — keputusan tersebut diserahkan kepada evaluasi PT Pertamina Patra Niaga.</w:t>
+        <w:t>Dokumen ini menyampaikan status pemenuhan syarat Termin 1 pada skema pembayaran dua termin proyek sertifikasi ATEX/IECEx Gas Leak Detector (GLD, Node Sensor) — Termin 1 sebesar 40 persen dari nilai SPK sertifikasi. Laporan menampilkan seluruh bukti yang tersedia di sisi tim pengembang serta pekerjaan lanjutan yang sedang disiapkan terhadap syarat kontraktual, tanpa menyimpulkan sendiri layak atau tidaknya pengajuan — keputusan tersebut diserahkan kepada evaluasi PT Pertamina Patra Niaga.</w:t>
       </w:r>
     </w:p>
     <w:p>
@@ -635,7 +635,7 @@
                 <w:color w:val="FFFFFF"/>
                 <w:sz w:val="17"/>
               </w:rPr>
-              <w:t>Ringkasan bukti/kekurangan</w:t>
+              <w:t>Ringkasan bukti dan tindak lanjut</w:t>
             </w:r>
           </w:p>
         </w:tc>
@@ -745,7 +745,7 @@
                 <w:color w:val="20262B"/>
                 <w:sz w:val="17"/>
               </w:rPr>
-              <w:t>Unit fisik terakit dan terfoto; identitas sampel/nomor seri/revisi belum ditetapkan formal.</w:t>
+              <w:t>Unit fisik terakit dan terfoto; nomor seri sampel GLD2-0x1001 telah ditetapkan pada formulir aplikasi; lembar identifikasi sampel bertanda tangan sedang disiapkan.</w:t>
             </w:r>
           </w:p>
         </w:tc>
@@ -831,7 +831,7 @@
                 <w:color w:val="9A6500"/>
                 <w:sz w:val="17"/>
               </w:rPr>
-              <w:t>DALAM PENYIAPAN</w:t>
+              <w:t>SEBAGIAN</w:t>
             </w:r>
           </w:p>
         </w:tc>
@@ -859,7 +859,7 @@
                 <w:color w:val="20262B"/>
                 <w:sz w:val="17"/>
               </w:rPr>
-              <w:t>Protokol dan hasil uji khusus enclosure yang traceable sedang disiapkan.</w:t>
+              <w:t>Uji termal internal 30 Sep 2026 telah dilaksanakan (8 titik thermocouple, 3 kondisi beban, 180 menit); uji mekanik, sealing/IP pra-uji, dan fault condition sedang disiapkan.</w:t>
             </w:r>
           </w:p>
         </w:tc>
@@ -1193,7 +1193,7 @@
                 <w:color w:val="20262B"/>
                 <w:sz w:val="17"/>
               </w:rPr>
-              <w:t>Sertifikasi masih tahap persiapan dokumen; sampel belum dikirim ke laboratorium sehingga urutan tahap masih terjaga.</w:t>
+              <w:t>Formulir aplikasi dan dossier teknis telah diajukan ke GTS (agen sertifikasi) sekitar 29 Sep 2026; pengujian di laboratorium terakreditasi dilakukan sesudah tahap ini, sehingga urutan tahap terjaga.</w:t>
             </w:r>
           </w:p>
         </w:tc>
@@ -1417,7 +1417,7 @@
                 <w:color w:val="20262B"/>
                 <w:sz w:val="17"/>
               </w:rPr>
-              <w:t>Laporan ini adalah laporan pekerjaan yang dimaksud, disusun dari seluruh bukti yang ada di repo per 15 September 2026.</w:t>
+              <w:t>Laporan ini adalah laporan pekerjaan yang dimaksud, disusun dari seluruh bukti pekerjaan per 2 Oktober 2026.</w:t>
             </w:r>
           </w:p>
         </w:tc>
@@ -1506,7 +1506,7 @@
           <w:color w:val="20262B"/>
           <w:sz w:val="21"/>
         </w:rPr>
-        <w:t>Bagian ini merinci bukti yang ditemukan dan kekurangan yang teridentifikasi untuk setiap syarat pada Bagian 2, berdasarkan audit repo dokumentasi proyek per 15 September 2026.</w:t>
+        <w:t>Bagian ini merinci bukti yang ditemukan dan tindak lanjut untuk setiap syarat pada Bagian 2, berdasarkan status pekerjaan per 2 Oktober 2026.</w:t>
       </w:r>
     </w:p>
     <w:p>
@@ -1573,7 +1573,7 @@
           <w:color w:val="9A6500"/>
           <w:sz w:val="23"/>
         </w:rPr>
-        <w:t>3.2 Prototipe telah diuji — DALAM PENYIAPAN</w:t>
+        <w:t>3.2 Prototipe telah diuji — SEBAGIAN</w:t>
       </w:r>
     </w:p>
     <w:p>
@@ -1595,7 +1595,7 @@
           <w:color w:val="20262B"/>
           <w:sz w:val="21"/>
         </w:rPr>
-        <w:t>Bukti pengujian fungsi sistem, dataset gas, komunikasi LoRa, dan chamber gas tersedia dan menunjukkan kematangan fungsi sistem secara umum. Proposal sertifikasi formal juga sudah menetapkan jenis pre-compliance test yang direncanakan.</w:t>
+        <w:t>Bukti pengujian fungsi sistem, dataset gas, komunikasi LoRa, dan chamber gas tersedia dan menunjukkan kematangan fungsi sistem secara umum. Proposal sertifikasi formal juga sudah menetapkan jenis pre-compliance test yang direncanakan. Uji termal internal telah dilaksanakan pada 30 September 2026: 8 titik thermocouple pada kondisi normal, beban maksimum, dan kipas mati selama 180 menit. Ekstrapolasi ke suhu ambien +60 °C memberikan suhu titik terpanas ± 114 °C, di bawah batas efektif kelas suhu T4 (130 °C).</w:t>
       </w:r>
     </w:p>
     <w:p>
@@ -1608,7 +1608,7 @@
           <w:color w:val="20262B"/>
           <w:sz w:val="21"/>
         </w:rPr>
-        <w:t>Protokol dan hasil uji khusus enclosure sedang disiapkan: inspeksi mekanik/dimensi, uji termal/hotspot, simulasi sealing atau IP pra-uji, maupun uji fault condition. Bukti kematangan fungsi sistem di atas tidak menggantikan pengujian enclosure ini.</w:t>
+        <w:t>Uji lanjutan khusus enclosure sedang disiapkan: inspeksi mekanik/dimensi, pelengkapan titik ukur termal, simulasi sealing atau IP pra-uji, maupun uji fault condition. Hasil uji termal internal akan dilengkapi dan disaksikan dalam sesi uji bersama Pertamina.</w:t>
       </w:r>
     </w:p>
     <w:p>
@@ -1748,7 +1748,7 @@
           <w:color w:val="20262B"/>
           <w:sz w:val="21"/>
         </w:rPr>
-        <w:t>Status proyek per pertengahan September 2026 menyatakan sertifikasi masih pada tahap persiapan dokumen; pengiriman sampel ke laboratorium terakreditasi dilakukan setelah tahap ini.</w:t>
+        <w:t>Formulir aplikasi ATEX dan dossier teknis telah diajukan ke GTS (agen sertifikasi) sekitar 29 September 2026; pengiriman sampel ke laboratorium terakreditasi dilakukan setelah tahap ini.</w:t>
       </w:r>
     </w:p>
     <w:p>
@@ -1850,7 +1850,7 @@
           <w:color w:val="20262B"/>
           <w:sz w:val="21"/>
         </w:rPr>
-        <w:t>Dokumen ini disusun sebagai laporan pekerjaan Termin 1 sertifikasi, merangkum seluruh bukti dan kekurangan di atas beserta register bukti pada Bagian 5.</w:t>
+        <w:t>Dokumen ini disusun sebagai laporan pekerjaan Termin 1 sertifikasi, merangkum seluruh bukti dan tindak lanjut di atas beserta register bukti pada Bagian 5.</w:t>
       </w:r>
     </w:p>
     <w:p>
@@ -1951,7 +1951,7 @@
           <w:color w:val="20262B"/>
           <w:sz w:val="21"/>
         </w:rPr>
-        <w:t>Sebagai konteks tambahan di luar syarat kontraktual Termin 1, tim pengembang memantau progres program sertifikasi dengan dua metrik yang tidak saling menggantikan:</w:t>
+        <w:t>Sebagai konteks tambahan di luar syarat kontraktual Termin 1, tim pengembang memantau progres program sertifikasi dengan metrik berikut:</w:t>
       </w:r>
     </w:p>
     <w:tbl>
@@ -2087,7 +2087,7 @@
                 <w:color w:val="20262B"/>
                 <w:sz w:val="17"/>
               </w:rPr>
-              <w:t>Progres keseluruhan proyek (5 fase x 4 track, bottom-up)</w:t>
+              <w:t>Kesiapan dokumen sertifikasi (21 butir checklist ExCB, berbobot)</w:t>
             </w:r>
           </w:p>
         </w:tc>
@@ -2114,7 +2114,7 @@
                 <w:color w:val="20262B"/>
                 <w:sz w:val="17"/>
               </w:rPr>
-              <w:t>≈ 20% (per 5 September 2026)</w:t>
+              <w:t>≈ 43% (per 30 September 2026)</w:t>
             </w:r>
           </w:p>
         </w:tc>
@@ -2141,7 +2141,7 @@
                 <w:color w:val="20262B"/>
                 <w:sz w:val="17"/>
               </w:rPr>
-              <w:t>Metrik paling konservatif — memasukkan fase Uji Laboratorium Terakreditasi (bobot 41,7% dari total durasi) yang dijadwalkan pada tahap berikutnya.</w:t>
+              <w:t>Kelengkapan dokumentasi teknis; tidak termasuk pelaksanaan pengujian di laboratorium.</w:t>
             </w:r>
           </w:p>
         </w:tc>
@@ -2171,7 +2171,7 @@
                 <w:color w:val="20262B"/>
                 <w:sz w:val="17"/>
               </w:rPr>
-              <w:t>Kesiapan dokumen ATEX (checklist teknis 29 item)</w:t>
+              <w:t>Pengajuan ke agen sertifikasi (GTS)</w:t>
             </w:r>
           </w:p>
         </w:tc>
@@ -2199,7 +2199,7 @@
                 <w:color w:val="20262B"/>
                 <w:sz w:val="17"/>
               </w:rPr>
-              <w:t>≈ 43%</w:t>
+              <w:t>Diajukan ± 29 September 2026</w:t>
             </w:r>
           </w:p>
         </w:tc>
@@ -2227,7 +2227,90 @@
                 <w:color w:val="20262B"/>
                 <w:sz w:val="17"/>
               </w:rPr>
-              <w:t>Murni kelengkapan dokumentasi/checklist teknis, tidak termasuk pelaksanaan pengujian.</w:t>
+              <w:t>Formulir aplikasi ATEX + dossier teknis; iterasi dokumen mengikuti tanggapan GTS.</w:t>
+            </w:r>
+          </w:p>
+        </w:tc>
+      </w:tr>
+      <w:tr>
+        <w:tc>
+          <w:tcPr>
+            <w:tcW w:type="dxa" w:w="3096"/>
+            <w:vAlign w:val="center"/>
+            <w:tcMar>
+              <w:top w:w="90" w:type="dxa"/>
+              <w:start w:w="110" w:type="dxa"/>
+              <w:bottom w:w="90" w:type="dxa"/>
+              <w:end w:w="110" w:type="dxa"/>
+            </w:tcMar>
+          </w:tcPr>
+          <w:p>
+            <w:pPr>
+              <w:spacing w:after="0" w:before="0" w:line="252" w:lineRule="auto"/>
+              <w:jc w:val="center"/>
+            </w:pPr>
+            <w:r>
+              <w:rPr>
+                <w:rFonts w:ascii="Arial" w:hAnsi="Arial"/>
+                <w:b w:val="0"/>
+                <w:color w:val="20262B"/>
+                <w:sz w:val="17"/>
+              </w:rPr>
+              <w:t>Uji termal internal</w:t>
+            </w:r>
+          </w:p>
+        </w:tc>
+        <w:tc>
+          <w:tcPr>
+            <w:tcW w:type="dxa" w:w="2160"/>
+            <w:vAlign w:val="center"/>
+            <w:tcMar>
+              <w:top w:w="90" w:type="dxa"/>
+              <w:start w:w="110" w:type="dxa"/>
+              <w:bottom w:w="90" w:type="dxa"/>
+              <w:end w:w="110" w:type="dxa"/>
+            </w:tcMar>
+          </w:tcPr>
+          <w:p>
+            <w:pPr>
+              <w:spacing w:after="0" w:before="0" w:line="252" w:lineRule="auto"/>
+              <w:jc w:val="left"/>
+            </w:pPr>
+            <w:r>
+              <w:rPr>
+                <w:rFonts w:ascii="Arial" w:hAnsi="Arial"/>
+                <w:b w:val="0"/>
+                <w:color w:val="20262B"/>
+                <w:sz w:val="17"/>
+              </w:rPr>
+              <w:t>Dilaksanakan 30 September 2026</w:t>
+            </w:r>
+          </w:p>
+        </w:tc>
+        <w:tc>
+          <w:tcPr>
+            <w:tcW w:type="dxa" w:w="4824"/>
+            <w:vAlign w:val="center"/>
+            <w:tcMar>
+              <w:top w:w="90" w:type="dxa"/>
+              <w:start w:w="110" w:type="dxa"/>
+              <w:bottom w:w="90" w:type="dxa"/>
+              <w:end w:w="110" w:type="dxa"/>
+            </w:tcMar>
+          </w:tcPr>
+          <w:p>
+            <w:pPr>
+              <w:spacing w:after="0" w:before="0" w:line="252" w:lineRule="auto"/>
+              <w:jc w:val="left"/>
+            </w:pPr>
+            <w:r>
+              <w:rPr>
+                <w:rFonts w:ascii="Arial" w:hAnsi="Arial"/>
+                <w:b w:val="0"/>
+                <w:color w:val="20262B"/>
+                <w:sz w:val="17"/>
+              </w:rPr>
+              <w:t>Indikasi positif kelas suhu T4 (± 114 °C vs batas 130 °C).</w:t>
             </w:r>
           </w:p>
         </w:tc>
@@ -2248,7 +2331,7 @@
           <w:color w:val="20262B"/>
           <w:sz w:val="21"/>
         </w:rPr>
-        <w:t>Kedua metrik ini adalah indikator kemajuan rekayasa dan administrasi internal, bukan pengganti penilaian pemenuhan syarat Termin 1 pada Bagian 2 dan 3. Skema klasifikasi area berbahaya yang ditargetkan proposal — Zona 1, Kategori 2G, Grup II, kelas suhu T4 (≤135°C) — sudah eksplisit; grup gas spesifik (rekomendasi tim: IIC) dan metode proteksi (Ex i atau Ex d) masih terbuka dan menjadi bagian dari pekerjaan uji lanjutan. Detail lengkap Kurva-S dan gap analysis per track ada di `Dashboard_Sertifikasi_GLD_ATEX_IECEx.html`.</w:t>
+        <w:t>Metrik ini adalah indikator kemajuan rekayasa dan administrasi internal, bukan pengganti penilaian pemenuhan syarat Termin 1 pada Bagian 2 dan 3. Skema klasifikasi area berbahaya yang ditargetkan proposal — Zona 1, Kategori 2G, Grup II, kelas suhu T4 (≤135°C) — sudah eksplisit; grup gas IIC dan metode proteksi Ex d (flameproof enclosure) telah ditetapkan, dengan penandaan yang diajukan II 2G Ex db IIC T4 Gb.</w:t>
       </w:r>
     </w:p>
     <w:p>
@@ -3247,7 +3330,7 @@
                 <w:color w:val="20262B"/>
                 <w:sz w:val="17"/>
               </w:rPr>
-              <w:t>Checklist dan analisis kekurangan sertifikasi</w:t>
+              <w:t>Checklist dan analisis kesiapan sertifikasi</w:t>
             </w:r>
           </w:p>
         </w:tc>
@@ -3275,7 +3358,7 @@
                 <w:color w:val="20262B"/>
                 <w:sz w:val="17"/>
               </w:rPr>
-              <w:t>`checklist-sertifikasi.html`, `laporan-analisis-kekurangan.html`, `status-kekurangan.html`.</w:t>
+              <w:t>Checklist sertifikasi, laporan analisis kesiapan, dan status per butir.</w:t>
             </w:r>
           </w:p>
         </w:tc>
@@ -3382,7 +3465,7 @@
           <w:color w:val="000000"/>
           <w:sz w:val="30"/>
         </w:rPr>
-        <w:t>6 Dokumen yang Masih Perlu Disusun</w:t>
+        <w:t>6 Dokumen Tahap Lanjutan</w:t>
       </w:r>
     </w:p>
     <w:p>
@@ -3796,7 +3879,7 @@
           <w:color w:val="20262B"/>
           <w:sz w:val="21"/>
         </w:rPr>
-        <w:t>Laporan ini menyajikan seluruh bukti yang tersedia di sisi tim pengembang serta kekurangan yang masih teridentifikasi terhadap ketujuh syarat Termin 1 sertifikasi sebagaimana diuraikan pada Bagian 2 dan 3. Tim pengembang tidak menyimpulkan sendiri apakah paket ini layak atau belum layak diajukan untuk pembayaran 40 persen — penilaian pemenuhan syarat dan keputusan tersebut sepenuhnya berada pada evaluasi PT Pertamina Patra Niaga, dengan matriks Bagian 3 sebagai acuan tinjau per syarat.</w:t>
+        <w:t>Laporan ini menyajikan seluruh bukti yang tersedia di sisi tim pengembang serta pekerjaan lanjutan terhadap ketujuh syarat Termin 1 sertifikasi sebagaimana diuraikan pada Bagian 2 dan 3. Berdasarkan bukti tersebut, LGU mengajukan pembayaran Termin 1 sebesar 40 persen; penilaian pemenuhan syarat dan keputusan tersebut sepenuhnya berada pada evaluasi PT Pertamina Patra Niaga, dengan matriks Bagian 3 sebagai acuan tinjau per syarat.</w:t>
       </w:r>
     </w:p>
     <w:p>
@@ -3809,7 +3892,7 @@
           <w:color w:val="20262B"/>
           <w:sz w:val="21"/>
         </w:rPr>
-        <w:t>Apabila PT Pertamina Patra Niaga memerlukan sesi uji dan witness bersama untuk menutup Syarat 2 sampai 4 dan 6, tim pengembang siap menjadwalkan pelaksanaan mengikuti kerangka kerja pada `Persiapan_Termin_1.md` (identitas prototipe, protokol uji, log iterasi, witness, hingga dokumen serah terima).</w:t>
+        <w:t>Apabila PT Pertamina Patra Niaga memerlukan sesi uji dan witness bersama untuk menutup Syarat 2 sampai 4 dan 6, tim pengembang siap menjadwalkan pelaksanaan mengikuti kerangka kerja pada kerangka kerja tim (identitas prototipe, protokol uji, log iterasi, witness, hingga dokumen serah terima).</w:t>
       </w:r>
     </w:p>
     <w:p>

</xml_diff>

<commit_message>
Laporan Termin Sertifikasi LGU: Syarat 3 SEBAGIAN (PCB Ver2, casing v2->v3), hapus path internal
Co-Authored-By: Claude Opus 5.5 <noreply@anthropic.com>
</commit_message>
<xml_diff>
--- a/Paket LGU/02_Penagihan_Termin_1/src/Laporan_Termin_1_Sertifikasi_LGU.docx
+++ b/Paket LGU/02_Penagihan_Termin_1/src/Laporan_Termin_1_Sertifikasi_LGU.docx
@@ -942,7 +942,7 @@
                 <w:color w:val="9A6500"/>
                 <w:sz w:val="17"/>
               </w:rPr>
-              <w:t>DALAM PENYIAPAN</w:t>
+              <w:t>SEBAGIAN</w:t>
             </w:r>
           </w:p>
         </w:tc>
@@ -969,7 +969,7 @@
                 <w:color w:val="20262B"/>
                 <w:sz w:val="17"/>
               </w:rPr>
-              <w:t>Log iterasi Rev A ke Rev B yang merujuk temuan uji disusun setelah uji enclosure.</w:t>
+              <w:t>Iterasi desain tersedia: PCB MotherBoard GLD Ver2 (BOM 9 Sep, layout 11 Sep 2026) dan casing ATEX v2 ke v3 (8 Sep 2026). Log keterkaitan revisi dengan temuan uji sedang dirangkum.</w:t>
             </w:r>
           </w:p>
         </w:tc>
@@ -1544,7 +1544,7 @@
           <w:color w:val="20262B"/>
           <w:sz w:val="21"/>
         </w:rPr>
-        <w:t>Tujuh foto perakitan pada `Sumber Dokumen/sertifikasi-atex-gld-v2-2026/GLD/`, tiga di antaranya menunjukkan urutan perakitan motherboard, pemasangan delapan sensor, hingga unit terakit lengkap (metadata foto utama tercatat 26 Agustus 2026). Desain mekanik pendukung tersedia pada `ATEX CASING v2` (STEP/OBJ) dan `Desain_Bracket_L_UBolt_GLD_Mounting.pdf`.</w:t>
+        <w:t>Tujuh foto perakitan prototipe, tiga di antaranya menunjukkan urutan perakitan motherboard, pemasangan delapan sensor, hingga unit terakit lengkap (metadata foto utama tercatat 26 Agustus 2026). Desain mekanik pendukung tersedia pada gambar CAD ATEX Casing v2 (STEP/OBJ) dan desain bracket U-bolt.</w:t>
       </w:r>
     </w:p>
     <w:p>
@@ -1624,7 +1624,7 @@
           <w:color w:val="9A6500"/>
           <w:sz w:val="23"/>
         </w:rPr>
-        <w:t>3.3 Ada iterasi perbaikan desain berbasis hasil uji — DALAM PENYIAPAN</w:t>
+        <w:t>3.3 Ada iterasi perbaikan desain berbasis hasil uji — SEBAGIAN</w:t>
       </w:r>
     </w:p>
     <w:p>
@@ -1646,7 +1646,7 @@
           <w:color w:val="20262B"/>
           <w:sz w:val="21"/>
         </w:rPr>
-        <w:t>Terdapat file desain `ATEX CASING v2` dan desain bracket U-bolt sebagai versi desain terkini.</w:t>
+        <w:t>Iterasi desain perangkat keras telah dilakukan pada dua komponen utama: (1) PCB motherboard direvisi menjadi MotherBoard GLD Ver2 (BOM 9 September 2026, layout PCB 11 September 2026) beserta sensor board MQ; (2) casing berkembang dari ATEX Casing v2 (desain mounting U-bolt) ke GLD ATEX Case v3 (8 September 2026) dengan mesh filter stainless steel, kipas DC, dan dimensi yang disesuaikan untuk kebutuhan sertifikasi Ex d.</w:t>
       </w:r>
     </w:p>
     <w:p>
@@ -1659,7 +1659,7 @@
           <w:color w:val="20262B"/>
           <w:sz w:val="21"/>
         </w:rPr>
-        <w:t>Desain tersebut terutama memodelkan assembly mounting/bracket, bukan riwayat iterasi enclosure. Change log Revisi A ke Revisi B yang merujuk temuan uji, tindakan koreksi, bukti implementasi, dan hasil uji ulang disusun setelah uji enclosure.</w:t>
+        <w:t>Change log formal yang menautkan setiap revisi dengan temuan uji, tindakan koreksi, bukti implementasi, dan hasil uji ulang (termasuk hasil uji termal 30 September 2026) sedang dirangkum.</w:t>
       </w:r>
     </w:p>
     <w:p>
@@ -2682,7 +2682,7 @@
                 <w:color w:val="20262B"/>
                 <w:sz w:val="17"/>
               </w:rPr>
-              <w:t>Basis desain mekanik enclosure dan mounting, `GLD U Bolt Bracket/`.</w:t>
+              <w:t>Basis desain mekanik enclosure dan mounting.</w:t>
             </w:r>
           </w:p>
         </w:tc>

</xml_diff>

<commit_message>
Laporan Termin Sertifikasi LGU: iterasi PCB GLD V1-V5 sebagai bukti Syarat 3 (Gambar 3.3)
Co-Authored-By: Claude Opus 5.5 <noreply@anthropic.com>
</commit_message>
<xml_diff>
--- a/Paket LGU/02_Penagihan_Termin_1/src/Laporan_Termin_1_Sertifikasi_LGU.docx
+++ b/Paket LGU/02_Penagihan_Termin_1/src/Laporan_Termin_1_Sertifikasi_LGU.docx
@@ -969,7 +969,7 @@
                 <w:color w:val="20262B"/>
                 <w:sz w:val="17"/>
               </w:rPr>
-              <w:t>Iterasi desain tersedia: PCB MotherBoard GLD Ver2 (BOM 9 Sep, layout 11 Sep 2026) dan casing ATEX v2 ke v3 (8 Sep 2026). Log keterkaitan revisi dengan temuan uji sedang dirangkum.</w:t>
+              <w:t>Iterasi desain tersedia: PCB Node Sensor GLD telah melalui lima versi (V1 hingga V5) dan casing berkembang dari ATEX Casing v2 ke v3 (8 Sep 2026). Log keterkaitan revisi dengan temuan uji sedang dirangkum.</w:t>
             </w:r>
           </w:p>
         </w:tc>
@@ -1646,7 +1646,7 @@
           <w:color w:val="20262B"/>
           <w:sz w:val="21"/>
         </w:rPr>
-        <w:t>Iterasi desain perangkat keras telah dilakukan pada dua komponen utama: (1) PCB motherboard direvisi menjadi MotherBoard GLD Ver2 (BOM 9 September 2026, layout PCB 11 September 2026) beserta sensor board MQ; (2) casing berkembang dari ATEX Casing v2 (desain mounting U-bolt) ke GLD ATEX Case v3 (8 September 2026) dengan mesh filter stainless steel, kipas DC, dan dimensi yang disesuaikan untuk kebutuhan sertifikasi Ex d.</w:t>
+        <w:t>Iterasi desain perangkat keras telah dilakukan pada dua komponen utama: (1) PCB Node Sensor GLD telah melalui lima versi, V1 hingga V5 (Gambar 3.3): V1 memuat soket delapan sensor MQ langsung pada papan utama; versi berikutnya memakai modul sensor MQ terpisah dengan penyempurnaan tata letak motherboard; V5 menggunakan susunan beberapa papan dengan konektor antar-papan dan terminal blok untuk kabel daya. Dokumentasi BOM dan layout PCB (EasyEDA) tersedia per 9–11 September 2026; (2) casing berkembang dari ATEX Casing v2 (desain mounting U-bolt) ke GLD ATEX Case v3 (8 September 2026) dengan mesh filter stainless steel, kipas DC, dan dimensi yang disesuaikan untuk kebutuhan sertifikasi Ex d.</w:t>
       </w:r>
     </w:p>
     <w:p>
@@ -1660,6 +1660,60 @@
           <w:sz w:val="21"/>
         </w:rPr>
         <w:t>Change log formal yang menautkan setiap revisi dengan temuan uji, tindakan koreksi, bukti implementasi, dan hasil uji ulang (termasuk hasil uji termal 30 September 2026) sedang dirangkum.</w:t>
+      </w:r>
+    </w:p>
+    <w:p>
+      <w:pPr>
+        <w:jc w:val="center"/>
+      </w:pPr>
+      <w:r>
+        <w:drawing>
+          <wp:inline xmlns:a="http://schemas.openxmlformats.org/drawingml/2006/main" xmlns:pic="http://schemas.openxmlformats.org/drawingml/2006/picture">
+            <wp:extent cx="5760720" cy="2317263"/>
+            <wp:docPr id="1" name="Picture 1"/>
+            <wp:cNvGraphicFramePr>
+              <a:graphicFrameLocks noChangeAspect="1"/>
+            </wp:cNvGraphicFramePr>
+            <a:graphic>
+              <a:graphicData uri="http://schemas.openxmlformats.org/drawingml/2006/picture">
+                <pic:pic>
+                  <pic:nvPicPr>
+                    <pic:cNvPr id="0" name="gld_pcb_v1_v5.png"/>
+                    <pic:cNvPicPr/>
+                  </pic:nvPicPr>
+                  <pic:blipFill>
+                    <a:blip r:embed="rId11"/>
+                    <a:stretch>
+                      <a:fillRect/>
+                    </a:stretch>
+                  </pic:blipFill>
+                  <pic:spPr>
+                    <a:xfrm>
+                      <a:off x="0" y="0"/>
+                      <a:ext cx="5760720" cy="2317263"/>
+                    </a:xfrm>
+                    <a:prstGeom prst="rect"/>
+                  </pic:spPr>
+                </pic:pic>
+              </a:graphicData>
+            </a:graphic>
+          </wp:inline>
+        </w:drawing>
+      </w:r>
+    </w:p>
+    <w:p>
+      <w:pPr>
+        <w:spacing w:after="160"/>
+        <w:jc w:val="center"/>
+      </w:pPr>
+      <w:r>
+        <w:rPr>
+          <w:rFonts w:ascii="Arial" w:hAnsi="Arial"/>
+          <w:i/>
+          <w:color w:val="5B6670"/>
+          <w:sz w:val="17"/>
+        </w:rPr>
+        <w:t>Gambar 3.3 Iterasi PCB Node Sensor GLD, versi V1 hingga V5 (tampak atas dan bawah)</w:t>
       </w:r>
     </w:p>
     <w:p>
@@ -1874,7 +1928,7 @@
         <w:drawing>
           <wp:inline xmlns:a="http://schemas.openxmlformats.org/drawingml/2006/main" xmlns:pic="http://schemas.openxmlformats.org/drawingml/2006/picture">
             <wp:extent cx="2651760" cy="4390320"/>
-            <wp:docPr id="1" name="Picture 1"/>
+            <wp:docPr id="2" name="Picture 2"/>
             <wp:cNvGraphicFramePr>
               <a:graphicFrameLocks noChangeAspect="1"/>
             </wp:cNvGraphicFramePr>
@@ -1886,7 +1940,7 @@
                     <pic:cNvPicPr/>
                   </pic:nvPicPr>
                   <pic:blipFill>
-                    <a:blip r:embed="rId11"/>
+                    <a:blip r:embed="rId12"/>
                     <a:stretch>
                       <a:fillRect/>
                     </a:stretch>
@@ -2342,7 +2396,7 @@
         <w:drawing>
           <wp:inline xmlns:a="http://schemas.openxmlformats.org/drawingml/2006/main" xmlns:pic="http://schemas.openxmlformats.org/drawingml/2006/picture">
             <wp:extent cx="5760720" cy="3909766"/>
-            <wp:docPr id="2" name="Picture 2"/>
+            <wp:docPr id="3" name="Picture 3"/>
             <wp:cNvGraphicFramePr>
               <a:graphicFrameLocks noChangeAspect="1"/>
             </wp:cNvGraphicFramePr>
@@ -2354,7 +2408,7 @@
                     <pic:cNvPicPr/>
                   </pic:nvPicPr>
                   <pic:blipFill>
-                    <a:blip r:embed="rId12"/>
+                    <a:blip r:embed="rId13"/>
                     <a:stretch>
                       <a:fillRect/>
                     </a:stretch>

</xml_diff>

<commit_message>
Paket LGU 02: hapus Referensi Dokumen internal & nama file dari laporan Termin
Co-Authored-By: Claude Opus 5.5 <noreply@anthropic.com>
</commit_message>
<xml_diff>
--- a/Paket LGU/02_Penagihan_Termin_1/src/Laporan_Termin_1_Sertifikasi_LGU.docx
+++ b/Paket LGU/02_Penagihan_Termin_1/src/Laporan_Termin_1_Sertifikasi_LGU.docx
@@ -1866,7 +1866,7 @@
           <w:color w:val="20262B"/>
           <w:sz w:val="21"/>
         </w:rPr>
-        <w:t>Notulen pembahasan bukan berita acara validasi hasil uji. Diperlukan berita acara khusus dengan hasil keputusan eksplisit, lampiran bukti uji, dan tanda tangan para pihak. Template kerja tersedia di `Template_Berita_Acara_Validasi_Prototipe.md` dan diisi setelah data uji pendasarnya tersedia.</w:t>
+        <w:t>Notulen pembahasan bukan berita acara validasi hasil uji. Diperlukan berita acara khusus dengan hasil keputusan eksplisit, lampiran bukti uji, dan tanda tangan para pihak. Template kerja telah tersedia dan diisi setelah data uji pendasarnya tersedia.</w:t>
       </w:r>
     </w:p>
     <w:p>
@@ -2650,7 +2650,7 @@
                 <w:color w:val="20262B"/>
                 <w:sz w:val="17"/>
               </w:rPr>
-              <w:t>3 foto urutan perakitan + 4 foto komponen di `sertifikasi-atex-gld-v2-2026/GLD/`.</w:t>
+              <w:t>3 foto urutan perakitan dan 4 foto komponen.</w:t>
             </w:r>
           </w:p>
         </w:tc>
@@ -2819,7 +2819,7 @@
                 <w:color w:val="20262B"/>
                 <w:sz w:val="17"/>
               </w:rPr>
-              <w:t>`Dokumen_spesifikasi_input_2.docx`, `Parameter spesifikasi EMC_lengkap.docx`.</w:t>
+              <w:t>Spesifikasi input sertifikasi dan parameter uji EMC.</w:t>
             </w:r>
           </w:p>
         </w:tc>
@@ -3326,7 +3326,7 @@
                 <w:color w:val="20262B"/>
                 <w:sz w:val="17"/>
               </w:rPr>
-              <w:t>Kurva-S, gap analysis 4 track, dan rubrik interpretasi progres.</w:t>
+              <w:t>Kurva-S dan pemantauan progres 4 jalur sertifikasi.</w:t>
             </w:r>
           </w:p>
         </w:tc>
@@ -3468,7 +3468,7 @@
                 <w:color w:val="20262B"/>
                 <w:sz w:val="17"/>
               </w:rPr>
-              <w:t>Persiapan_Termin_1.md dan 3 template kerja</w:t>
+              <w:t>Rencana kerja Termin 1 dan template kerja</w:t>
             </w:r>
           </w:p>
         </w:tc>
@@ -3495,7 +3495,7 @@
                 <w:color w:val="20262B"/>
                 <w:sz w:val="17"/>
               </w:rPr>
-              <w:t>Matriks gap awal (10 September 2026) dan template log uji, berita acara, serta laporan pekerjaan.</w:t>
+              <w:t>Rencana kerja (10 September 2026) serta template log uji, berita acara, dan laporan pekerjaan.</w:t>
             </w:r>
           </w:p>
         </w:tc>
@@ -3695,7 +3695,7 @@
                 <w:color w:val="20262B"/>
                 <w:sz w:val="17"/>
               </w:rPr>
-              <w:t>`Template_Log_Uji_dan_Iterasi_Enclosure.md`</w:t>
+              <w:t>Template tersedia</w:t>
             </w:r>
           </w:p>
         </w:tc>
@@ -3780,7 +3780,7 @@
                 <w:color w:val="20262B"/>
                 <w:sz w:val="17"/>
               </w:rPr>
-              <w:t>`Template_Berita_Acara_Validasi_Prototipe.md`</w:t>
+              <w:t>Template tersedia</w:t>
             </w:r>
           </w:p>
         </w:tc>

</xml_diff>